<commit_message>
Updated all scores to noto serif SC. Edits to pieces
</commit_message>
<xml_diff>
--- a/Updated Text Styles.docx
+++ b/Updated Text Styles.docx
@@ -25,12 +25,6 @@
         <w:gridCol w:w="2700"/>
       </w:tblGrid>
       <w:tr>
-        <w:tblPrEx>
-          <w:tblCellMar>
-            <w:top w:w="0" w:type="dxa"/>
-            <w:bottom w:w="0" w:type="dxa"/>
-          </w:tblCellMar>
-        </w:tblPrEx>
         <w:tc>
           <w:tcPr>
             <w:tcW w:w="1818" w:type="dxa"/>
@@ -245,10 +239,6 @@
           <w:tblBorders>
             <w:top w:val="none" w:sz="0" w:space="0" w:color="auto"/>
           </w:tblBorders>
-          <w:tblCellMar>
-            <w:top w:w="0" w:type="dxa"/>
-            <w:bottom w:w="0" w:type="dxa"/>
-          </w:tblCellMar>
         </w:tblPrEx>
         <w:tc>
           <w:tcPr>
@@ -424,10 +414,6 @@
           <w:tblBorders>
             <w:top w:val="none" w:sz="0" w:space="0" w:color="auto"/>
           </w:tblBorders>
-          <w:tblCellMar>
-            <w:top w:w="0" w:type="dxa"/>
-            <w:bottom w:w="0" w:type="dxa"/>
-          </w:tblCellMar>
         </w:tblPrEx>
         <w:tc>
           <w:tcPr>
@@ -603,10 +589,6 @@
           <w:tblBorders>
             <w:top w:val="none" w:sz="0" w:space="0" w:color="auto"/>
           </w:tblBorders>
-          <w:tblCellMar>
-            <w:top w:w="0" w:type="dxa"/>
-            <w:bottom w:w="0" w:type="dxa"/>
-          </w:tblCellMar>
         </w:tblPrEx>
         <w:tc>
           <w:tcPr>
@@ -646,7 +628,11 @@
               <w:right w:w="100" w:type="nil"/>
             </w:tcMar>
           </w:tcPr>
-          <w:p/>
+          <w:p>
+            <w:r>
+              <w:t>16</w:t>
+            </w:r>
+          </w:p>
         </w:tc>
         <w:tc>
           <w:tcPr>
@@ -664,7 +650,11 @@
               <w:right w:w="100" w:type="nil"/>
             </w:tcMar>
           </w:tcPr>
-          <w:p/>
+          <w:p>
+            <w:r>
+              <w:t>Bold</w:t>
+            </w:r>
+          </w:p>
         </w:tc>
         <w:tc>
           <w:tcPr>
@@ -682,7 +672,11 @@
               <w:right w:w="100" w:type="nil"/>
             </w:tcMar>
           </w:tcPr>
-          <w:p/>
+          <w:p>
+            <w:r>
+              <w:t>NA</w:t>
+            </w:r>
+          </w:p>
         </w:tc>
         <w:tc>
           <w:tcPr>
@@ -700,7 +694,11 @@
               <w:right w:w="100" w:type="nil"/>
             </w:tcMar>
           </w:tcPr>
-          <w:p/>
+          <w:p>
+            <w:r>
+              <w:t>100%</w:t>
+            </w:r>
+          </w:p>
         </w:tc>
         <w:tc>
           <w:tcPr>
@@ -754,16 +752,7 @@
               <w:right w:w="100" w:type="nil"/>
             </w:tcMar>
           </w:tcPr>
-          <w:p>
-            <w:r>
-              <w:t>$</w:t>
-            </w:r>
-            <w:proofErr w:type="spellStart"/>
-            <w:r>
-              <w:t>PartName</w:t>
-            </w:r>
-            <w:proofErr w:type="spellEnd"/>
-          </w:p>
+          <w:p/>
         </w:tc>
       </w:tr>
       <w:tr>
@@ -771,10 +760,6 @@
           <w:tblBorders>
             <w:top w:val="none" w:sz="0" w:space="0" w:color="auto"/>
           </w:tblBorders>
-          <w:tblCellMar>
-            <w:top w:w="0" w:type="dxa"/>
-            <w:bottom w:w="0" w:type="dxa"/>
-          </w:tblCellMar>
         </w:tblPrEx>
         <w:tc>
           <w:tcPr>
@@ -948,7 +933,7 @@
           </w:tcPr>
           <w:p>
             <w:r>
-              <w:t>$</w:t>
+              <w:t>$PartName</w:t>
             </w:r>
           </w:p>
         </w:tc>
@@ -958,10 +943,6 @@
           <w:tblBorders>
             <w:top w:val="none" w:sz="0" w:space="0" w:color="auto"/>
           </w:tblBorders>
-          <w:tblCellMar>
-            <w:top w:w="0" w:type="dxa"/>
-            <w:bottom w:w="0" w:type="dxa"/>
-          </w:tblCellMar>
         </w:tblPrEx>
         <w:tc>
           <w:tcPr>
@@ -1137,10 +1118,6 @@
           <w:tblBorders>
             <w:top w:val="none" w:sz="0" w:space="0" w:color="auto"/>
           </w:tblBorders>
-          <w:tblCellMar>
-            <w:top w:w="0" w:type="dxa"/>
-            <w:bottom w:w="0" w:type="dxa"/>
-          </w:tblCellMar>
         </w:tblPrEx>
         <w:tc>
           <w:tcPr>
@@ -1321,10 +1298,6 @@
           <w:tblBorders>
             <w:top w:val="none" w:sz="0" w:space="0" w:color="auto"/>
           </w:tblBorders>
-          <w:tblCellMar>
-            <w:top w:w="0" w:type="dxa"/>
-            <w:bottom w:w="0" w:type="dxa"/>
-          </w:tblCellMar>
         </w:tblPrEx>
         <w:tc>
           <w:tcPr>
@@ -1500,10 +1473,6 @@
           <w:tblBorders>
             <w:top w:val="none" w:sz="0" w:space="0" w:color="auto"/>
           </w:tblBorders>
-          <w:tblCellMar>
-            <w:top w:w="0" w:type="dxa"/>
-            <w:bottom w:w="0" w:type="dxa"/>
-          </w:tblCellMar>
         </w:tblPrEx>
         <w:tc>
           <w:tcPr>
@@ -1675,10 +1644,6 @@
           <w:tblBorders>
             <w:top w:val="none" w:sz="0" w:space="0" w:color="auto"/>
           </w:tblBorders>
-          <w:tblCellMar>
-            <w:top w:w="0" w:type="dxa"/>
-            <w:bottom w:w="0" w:type="dxa"/>
-          </w:tblCellMar>
         </w:tblPrEx>
         <w:tc>
           <w:tcPr>
@@ -1859,10 +1824,6 @@
           <w:tblBorders>
             <w:top w:val="none" w:sz="0" w:space="0" w:color="auto"/>
           </w:tblBorders>
-          <w:tblCellMar>
-            <w:top w:w="0" w:type="dxa"/>
-            <w:bottom w:w="0" w:type="dxa"/>
-          </w:tblCellMar>
         </w:tblPrEx>
         <w:tc>
           <w:tcPr>
@@ -2042,10 +2003,6 @@
           <w:tblBorders>
             <w:top w:val="none" w:sz="0" w:space="0" w:color="auto"/>
           </w:tblBorders>
-          <w:tblCellMar>
-            <w:top w:w="0" w:type="dxa"/>
-            <w:bottom w:w="0" w:type="dxa"/>
-          </w:tblCellMar>
         </w:tblPrEx>
         <w:tc>
           <w:tcPr>
@@ -2221,10 +2178,6 @@
           <w:tblBorders>
             <w:top w:val="none" w:sz="0" w:space="0" w:color="auto"/>
           </w:tblBorders>
-          <w:tblCellMar>
-            <w:top w:w="0" w:type="dxa"/>
-            <w:bottom w:w="0" w:type="dxa"/>
-          </w:tblCellMar>
         </w:tblPrEx>
         <w:tc>
           <w:tcPr>
@@ -2396,10 +2349,6 @@
           <w:tblBorders>
             <w:top w:val="none" w:sz="0" w:space="0" w:color="auto"/>
           </w:tblBorders>
-          <w:tblCellMar>
-            <w:top w:w="0" w:type="dxa"/>
-            <w:bottom w:w="0" w:type="dxa"/>
-          </w:tblCellMar>
         </w:tblPrEx>
         <w:tc>
           <w:tcPr>
@@ -2572,10 +2521,6 @@
           <w:tblBorders>
             <w:top w:val="none" w:sz="0" w:space="0" w:color="auto"/>
           </w:tblBorders>
-          <w:tblCellMar>
-            <w:top w:w="0" w:type="dxa"/>
-            <w:bottom w:w="0" w:type="dxa"/>
-          </w:tblCellMar>
         </w:tblPrEx>
         <w:tc>
           <w:tcPr>
@@ -2756,10 +2701,6 @@
           <w:tblBorders>
             <w:top w:val="none" w:sz="0" w:space="0" w:color="auto"/>
           </w:tblBorders>
-          <w:tblCellMar>
-            <w:top w:w="0" w:type="dxa"/>
-            <w:bottom w:w="0" w:type="dxa"/>
-          </w:tblCellMar>
         </w:tblPrEx>
         <w:tc>
           <w:tcPr>
@@ -2931,10 +2872,6 @@
           <w:tblBorders>
             <w:top w:val="none" w:sz="0" w:space="0" w:color="auto"/>
           </w:tblBorders>
-          <w:tblCellMar>
-            <w:top w:w="0" w:type="dxa"/>
-            <w:bottom w:w="0" w:type="dxa"/>
-          </w:tblCellMar>
         </w:tblPrEx>
         <w:tc>
           <w:tcPr>
@@ -3106,10 +3043,6 @@
           <w:tblBorders>
             <w:top w:val="none" w:sz="0" w:space="0" w:color="auto"/>
           </w:tblBorders>
-          <w:tblCellMar>
-            <w:top w:w="0" w:type="dxa"/>
-            <w:bottom w:w="0" w:type="dxa"/>
-          </w:tblCellMar>
         </w:tblPrEx>
         <w:tc>
           <w:tcPr>
@@ -3285,10 +3218,6 @@
           <w:tblBorders>
             <w:top w:val="none" w:sz="0" w:space="0" w:color="auto"/>
           </w:tblBorders>
-          <w:tblCellMar>
-            <w:top w:w="0" w:type="dxa"/>
-            <w:bottom w:w="0" w:type="dxa"/>
-          </w:tblCellMar>
         </w:tblPrEx>
         <w:tc>
           <w:tcPr>
@@ -3458,10 +3387,6 @@
           <w:tblBorders>
             <w:top w:val="none" w:sz="0" w:space="0" w:color="auto"/>
           </w:tblBorders>
-          <w:tblCellMar>
-            <w:top w:w="0" w:type="dxa"/>
-            <w:bottom w:w="0" w:type="dxa"/>
-          </w:tblCellMar>
         </w:tblPrEx>
         <w:tc>
           <w:tcPr>
@@ -3617,12 +3542,6 @@
         </w:tc>
       </w:tr>
       <w:tr>
-        <w:tblPrEx>
-          <w:tblCellMar>
-            <w:top w:w="0" w:type="dxa"/>
-            <w:bottom w:w="0" w:type="dxa"/>
-          </w:tblCellMar>
-        </w:tblPrEx>
         <w:tc>
           <w:tcPr>
             <w:tcW w:w="1818" w:type="dxa"/>
@@ -4385,6 +4304,7 @@
   <w:style w:type="character" w:default="1" w:styleId="DefaultParagraphFont">
     <w:name w:val="Default Paragraph Font"/>
     <w:uiPriority w:val="1"/>
+    <w:semiHidden/>
     <w:unhideWhenUsed/>
   </w:style>
   <w:style w:type="table" w:default="1" w:styleId="TableNormal">

</xml_diff>